<commit_message>
Added a Powerpoint Presentation file
</commit_message>
<xml_diff>
--- a/AI CV Screening - Project Documentation by Patrick Gabriel Peter (23-SC-CO-008).docx
+++ b/AI CV Screening - Project Documentation by Patrick Gabriel Peter (23-SC-CO-008).docx
@@ -6586,7 +6586,7 @@
           <w:sz w:val="24"/>
           <w:szCs w:val="24"/>
         </w:rPr>
-        <w:t xml:space="preserve">The Students Industrial Work Experience Scheme was introduced to address the gap between theoretical instruction in higher institutions and the practical skills required by employers. The scheme provides students with opportunities to gain supervised industrial experience before completing their academic programmes, thereby improving their readiness for employment and professional practice. During the training period, students are expected to participate in activities relevant to their disciplines, observe professional procedures, work with appropriate tools and technologies, and document their experiences through industrial training records and reports. For Computer Science students in particular, SIWES can provide exposure to modern computing practices and technologies that may not be fully available within the traditional classroom environment. The experience gained during the placement </w:t>
+        <w:t xml:space="preserve">The Students Industrial Work Experience Scheme was introduced to address the gap between theoretical instruction in higher institutions and the practical skills required by employers. The scheme provides students with opportunities to gain supervised industrial experience before completing their academic programmes, thereby improving their readiness for employment and professional practice. During the training period, students are expected to participate in activities relevant to their disciplines, observe professional procedures, work with appropriate tools and technologies and document their experiences through industrial training records and reports. For Computer Science students in particular, SIWES can provide exposure to modern computing practices and technologies that may not be fully available within the traditional classroom environment. The experience gained during the placement </w:t>
       </w:r>
       <w:r>
         <w:rPr>
@@ -6638,7 +6638,7 @@
           <w:sz w:val="24"/>
           <w:szCs w:val="24"/>
         </w:rPr>
-        <w:t>Siliconshore is an AI and robotics organization committed to developing people and creating innovative technology solutions. The organization focuses on equipping individuals with the knowledge, technical skills, and practical capabilities required to design, develop, and implement artificial intelligence solutions, while also extending its activities into robotics and other emerging technologies. Registered with the Corporate Affairs Commission (CAC) under the Engineering and Software Development sectors, Siliconshore integrates technical education, engineering, software development, research, and technological innovation into its operations. Founded by two partners and supported by a five-member core team, the organization is focused on establishing itself as a significant contributor to research-driven advancements in artificial intelligence, robotics, and related technologies. Its approach extends beyond the acquisition of technological knowledge, emphasizing the development of competent individuals, the pursuit of relevant research, and the transformation of innovative ideas into practical solutions capable of addressing real-world challenges.</w:t>
+        <w:t>Siliconshore is an AI and robotics organization committed to developing people and creating innovative technology solutions. The organization focuses on equipping individuals with the knowledge, technical skills and practical capabilities required to design, develop and implement artificial intelligence solutions, while also extending its activities into robotics and other emerging technologies. Registered with the Corporate Affairs Commission (CAC) under the Engineering and Software Development sectors, Siliconshore integrates technical education, engineering, software development, research and technological innovation into its operations. Founded by two partners and supported by a five-member core team, the organization is focused on establishing itself as a significant contributor to research-driven advancements in artificial intelligence, robotics and related technologies. Its approach extends beyond the acquisition of technological knowledge, emphasizing the development of competent individuals, the pursuit of relevant research and the transformation of innovative ideas into practical solutions capable of addressing real-world challenges.</w:t>
       </w:r>
     </w:p>
     <w:p>
@@ -6681,7 +6681,7 @@
           <w:sz w:val="24"/>
           <w:szCs w:val="24"/>
         </w:rPr>
-        <w:t xml:space="preserve">Siliconshore was established with a core commitment to developing people and creating innovative artificial intelligence solutions, with robotics serving as an important component of its broader technological vision. Founded by two partners, the organization has grown around a five-member core team comprising individuals with interests and expertise in technology, engineering, software development, learning, research, and innovation. Siliconshore is formally registered with the Corporate Affairs Commission (CAC) under the Engineering and Software Development sectors, providing an established foundation for its </w:t>
+        <w:t xml:space="preserve">Siliconshore was established with a core commitment to developing people and creating innovative artificial intelligence solutions, with robotics serving as an important component of its broader technological vision. Founded by two partners, the organization has grown around a five-member core team comprising individuals with interests and expertise in technology, engineering, software development, learning, research and innovation. Siliconshore is formally registered with the Corporate Affairs Commission (CAC) under the Engineering and Software Development sectors, providing an established foundation for its </w:t>
       </w:r>
       <w:r>
         <w:rPr>
@@ -7313,7 +7313,7 @@
           <w:sz w:val="24"/>
           <w:szCs w:val="24"/>
         </w:rPr>
-        <w:t>This chapter provided an overview of the Students Industrial Work Experience Scheme (SIWES) and its significance in bridging the gap between theoretical knowledge and practical experience. It introduced Siliconshore, the organization where the internship was undertaken, including its background, technological focus, and commitment to artificial intelligence, robotics, software development, research, and innovation. The chapter also established the duration and scope of the internship, which was undertaken from 1st June to 30th September 2026 under the Artificial Intelligence and Machine Learning Department. The training provided practical exposure to machine learning concepts, programming, data analysis, model development, and related technologies, thereby providing a foundation for the practical skills and experiences discussed in the subsequent chapters of this report.</w:t>
+        <w:t>This chapter provided an overview of the Students Industrial Work Experience Scheme (SIWES) and its significance in bridging the gap between theoretical knowledge and practical experience. It introduced Siliconshore, the organization where the internship was undertaken, including its background, technological focus, and commitment to artificial intelligence, robotics, software development, research and innovation. The chapter also established the duration and scope of the internship, which was undertaken from 1st June to 30th September 2026 under the Artificial Intelligence and Machine Learning Department. The training provided practical exposure to machine learning concepts, programming, data analysis, model development and related technologies, thereby providing a foundation for the practical skills and experiences discussed in the subsequent chapters of this report.</w:t>
       </w:r>
     </w:p>
     <w:p>
@@ -7509,7 +7509,7 @@
           <w:sz w:val="24"/>
           <w:szCs w:val="24"/>
         </w:rPr>
-        <w:t>, and modelling data. The training also introduced me to Natural Language Processing and the development of machine learning solutions through practical projects. These activities improved my understanding of the machine learning workflow and strengthened my problem-solving, analytical, and programming abilities. This chapter presents the major technical and practical skills acquired throughout the internship and explains how they were applied during the training period.</w:t>
+        <w:t xml:space="preserve"> and modelling data. The training also introduced me to Natural Language Processing and the development of machine learning solutions through practical projects. These activities improved my understanding of the machine learning workflow and strengthened my problem-solving, analytical and programming abilities. This chapter presents the major technical and practical skills acquired throughout the internship and explains how they were applied during the training period.</w:t>
       </w:r>
     </w:p>
     <w:p>
@@ -7572,7 +7572,7 @@
           <w:sz w:val="24"/>
           <w:szCs w:val="24"/>
         </w:rPr>
-        <w:t xml:space="preserve">, which served as the primary programming language for the machine learning activities undertaken during the internship. The training began with fundamental Python concepts, including variables, data types, operators, conditional statements, loops, functions, lists, dictionaries, and other data structures. As the training progressed, more advanced programming concepts such as exception handling, regular expressions, object-oriented programming, and the use of external libraries were introduced. Python was subsequently applied to practical tasks involving data manipulation, analysis, visualization, and machine </w:t>
+        <w:t xml:space="preserve">, which served as the primary programming language for the machine learning activities undertaken during the internship. The training began with fundamental Python concepts, including variables, data types, operators, conditional statements, loops, functions, lists, dictionaries, and other data structures. As the training progressed, more advanced programming concepts such as exception handling, regular expressions, object-oriented programming, and the use of external libraries were introduced. Python was subsequently applied to practical tasks involving data manipulation, analysis, visualization and machine </w:t>
       </w:r>
       <w:r>
         <w:rPr>
@@ -7591,15 +7591,15 @@
           <w:sz w:val="24"/>
           <w:szCs w:val="24"/>
         </w:rPr>
-        <w:t>NumPy, Pandas, Matplotlib, and Scikit-learn</w:t>
-      </w:r>
-      <w:r>
-        <w:rPr>
-          <w:rFonts w:eastAsia="Calibri"/>
-          <w:sz w:val="24"/>
-          <w:szCs w:val="24"/>
-        </w:rPr>
-        <w:t xml:space="preserve"> were used extensively to perform numerical operations, manipulate datasets, visualize patterns, preprocess data, and develop machine learning models. This practical exposure established Python as an essential tool for implementing the different stages of the machine learning workflow and improved my ability to translate computational concepts into working solutions.</w:t>
+        <w:t>NumPy, Pandas, Matplotlib and Scikit-learn</w:t>
+      </w:r>
+      <w:r>
+        <w:rPr>
+          <w:rFonts w:eastAsia="Calibri"/>
+          <w:sz w:val="24"/>
+          <w:szCs w:val="24"/>
+        </w:rPr>
+        <w:t xml:space="preserve"> were used extensively to perform numerical operations, manipulate datasets, visualize patterns, preprocess data and develop machine learning models. This practical exposure established Python as an essential tool for implementing the different stages of the machine learning workflow and improved my ability to translate computational concepts into working solutions.</w:t>
       </w:r>
     </w:p>
     <w:p>
@@ -7662,7 +7662,7 @@
           <w:sz w:val="24"/>
           <w:szCs w:val="24"/>
         </w:rPr>
-        <w:t xml:space="preserve"> before applying machine learning techniques. The training emphasized the importance of identifying the structure, attributes, data types, and purpose of a dataset before commencing analysis or model development. I learned how to load datasets from sources such as CSV files into Python using the Pandas library and examine their rows, columns, data types, unique values, and statistical properties. Attention was also given to identifying the distinction between numerical, categorical, and textual data and determining how each type should be handled during subsequent stages of the machine learning workflow. Through practical exercises, I developed the ability to assess whether a dataset was suitable for a particular machine learning problem, identify relevant features and target variables, and recognize issues such as missing values, duplicate records, inconsistent data, and irrelevant attributes. This stage provided an important foundation for ensuring that subsequent analysis and machine learning models were based on properly understood and appropriately prepared data.</w:t>
+        <w:t xml:space="preserve"> before applying machine learning techniques. The training emphasized the importance of identifying the structure, attributes, data types and purpose of a dataset before commencing analysis or model development. I learned how to load datasets from sources such as CSV files into Python using the Pandas library and examine their rows, columns, data types, unique values and statistical properties. Attention was also given to identifying the distinction between numerical, categorical and textual data and determining how each type should be handled during subsequent stages of the machine learning workflow. Through practical exercises, I developed the ability to assess whether a dataset was suitable for a particular machine learning problem, identify relevant features and target variables and recognize issues such as missing values, duplicate records, inconsistent data, and irrelevant attributes. This stage provided an important foundation for ensuring that subsequent analysis and machine learning models were based on properly understood and appropriately prepared data.</w:t>
       </w:r>
     </w:p>
     <w:p>
@@ -7716,7 +7716,7 @@
           <w:szCs w:val="24"/>
         </w:rPr>
         <w:lastRenderedPageBreak/>
-        <w:t xml:space="preserve">handling missing values, removing duplicate records, correcting inconsistent data, and converting variables into appropriate formats. I also gained practical experience working with categorical variables through techniques such as </w:t>
+        <w:t xml:space="preserve">handling missing values, removing duplicate records, correcting inconsistent data and converting variables into appropriate formats. I also gained practical experience working with categorical variables through techniques such as </w:t>
       </w:r>
       <w:r>
         <w:rPr>
@@ -7726,15 +7726,15 @@
           <w:sz w:val="24"/>
           <w:szCs w:val="24"/>
         </w:rPr>
-        <w:t>label encoding, one-hot encoding, and mapping</w:t>
-      </w:r>
-      <w:r>
-        <w:rPr>
-          <w:rFonts w:eastAsia="Calibri"/>
-          <w:sz w:val="24"/>
-          <w:szCs w:val="24"/>
-        </w:rPr>
-        <w:t xml:space="preserve">, as well as transforming textual and numerical data into suitable machine learning representations. Additional preprocessing techniques included handling outliers, examining skewed distributions, and applying appropriate transformations where necessary. I also learned how to use tools such as </w:t>
+        <w:t>label encoding, one-hot encoding and mapping</w:t>
+      </w:r>
+      <w:r>
+        <w:rPr>
+          <w:rFonts w:eastAsia="Calibri"/>
+          <w:sz w:val="24"/>
+          <w:szCs w:val="24"/>
+        </w:rPr>
+        <w:t xml:space="preserve">, as well as transforming textual and numerical data into suitable machine learning representations. Additional preprocessing techniques included handling outliers, examining skewed distributions and applying appropriate transformations where necessary. I also learned how to use tools such as </w:t>
       </w:r>
       <w:r>
         <w:rPr>
@@ -7752,7 +7752,7 @@
           <w:sz w:val="24"/>
           <w:szCs w:val="24"/>
         </w:rPr>
-        <w:t xml:space="preserve"> to apply different preprocessing operations to different groups of features. These activities demonstrated the importance of data quality and consistency, as improperly prepared data can negatively affect the performance, reliability, and interpretability of a machine learning model.</w:t>
+        <w:t xml:space="preserve"> to apply different preprocessing operations to different groups of features. These activities demonstrated the importance of data quality and consistency, as improperly prepared data can negatively affect the performance, reliability and interpretability of a machine learning model.</w:t>
       </w:r>
     </w:p>
     <w:p>
@@ -7815,7 +7815,7 @@
           <w:sz w:val="24"/>
           <w:szCs w:val="24"/>
         </w:rPr>
-        <w:t xml:space="preserve">, which involves systematically examining a dataset to understand its structure, characteristics, patterns, and relationships before developing a machine learning model. I learned how to use Pandas to inspect datasets, generate descriptive statistics, identify missing values and duplicate records, and examine the distribution of individual features. Visualization techniques were also applied using </w:t>
+        <w:t xml:space="preserve">, which involves systematically examining a dataset to understand its structure, characteristics, patterns and relationships before developing a machine learning model. I learned how to use Pandas to inspect datasets, generate descriptive statistics, identify missing values and duplicate records and examine the distribution of individual features. Visualization techniques were also applied using </w:t>
       </w:r>
       <w:r>
         <w:rPr>
@@ -7833,7 +7833,7 @@
           <w:sz w:val="24"/>
           <w:szCs w:val="24"/>
         </w:rPr>
-        <w:t xml:space="preserve"> to represent data through histograms, boxplots, scatter plots, and correlation heatmaps. These techniques made it possible to identify trends, unusual observations, outliers, and relationships between variables. I also learned how to </w:t>
+        <w:t xml:space="preserve"> to represent data through histograms, boxplots, scatter plots and correlation heatmaps. These techniques made it possible to identify trends, unusual observations, outliers and relationships between variables. I also learned how to </w:t>
       </w:r>
       <w:r>
         <w:rPr>
@@ -7849,7 +7849,7 @@
           <w:sz w:val="24"/>
           <w:szCs w:val="24"/>
         </w:rPr>
-        <w:t xml:space="preserve"> categorical variables and examine correlations between numerical features to determine their potential relevance to a machine learning problem. EDA therefore provided a systematic approach to understanding data and making informed decisions about subsequent preprocessing, feature engineering, and model development stages.</w:t>
+        <w:t xml:space="preserve"> categorical variables and examine correlations between numerical features to determine their potential relevance to a machine learning problem. EDA therefore provided a systematic approach to understanding data and making informed decisions about subsequent preprocessing, feature engineering and model development stages.</w:t>
       </w:r>
     </w:p>
     <w:p>
@@ -7895,7 +7895,7 @@
           <w:szCs w:val="24"/>
         </w:rPr>
         <w:lastRenderedPageBreak/>
-        <w:t xml:space="preserve">Data visualization was another important skill developed during the SIWES training. I learned how to represent data graphically in order to make patterns, trends, distributions, and relationships easier to understand and interpret. </w:t>
+        <w:t xml:space="preserve">Data visualization was another important skill developed during the SIWES training. I learned how to represent data graphically in order to make patterns, trends, distributions and relationships easier to understand and interpret. </w:t>
       </w:r>
       <w:r>
         <w:rPr>
@@ -7913,7 +7913,7 @@
           <w:sz w:val="24"/>
           <w:szCs w:val="24"/>
         </w:rPr>
-        <w:t xml:space="preserve"> were used to create different types of visualizations, including bar charts, histograms, boxplots, scatter plots, and correlation heatmaps. Histograms were used to examine the distribution of numerical variables, while boxplots helped in identifying potential outliers. Bar charts were applied to </w:t>
+        <w:t xml:space="preserve"> were used to create different types of visualizations, including bar charts, histograms, boxplots, scatter plots and correlation heatmaps. Histograms were used to examine the distribution of numerical variables, while boxplots helped in identifying potential outliers. Bar charts were applied to </w:t>
       </w:r>
       <w:r>
         <w:rPr>
@@ -7929,7 +7929,7 @@
           <w:sz w:val="24"/>
           <w:szCs w:val="24"/>
         </w:rPr>
-        <w:t xml:space="preserve"> categorical data, and scatter plots were used to investigate relationships between numerical variables. Correlation heatmaps were also used to examine the strength and direction of relationships among numerical features. Through these practical exercises, I developed the ability to select appropriate visualization techniques for different analytical objectives and use graphical representations to support data-driven decisions during the machine learning process.</w:t>
+        <w:t xml:space="preserve"> categorical data and scatter plots were used to investigate relationships between numerical variables. Correlation heatmaps were also used to examine the strength and direction of relationships among numerical features. Through these practical exercises, I developed the ability to select appropriate visualization techniques for different analytical objectives and use graphical representations to support data-driven decisions during the machine learning process.</w:t>
       </w:r>
     </w:p>
     <w:p>
@@ -7992,7 +7992,7 @@
           <w:sz w:val="24"/>
           <w:szCs w:val="24"/>
         </w:rPr>
-        <w:t xml:space="preserve">, which are important processes for improving the quality and effectiveness of machine learning models. Feature engineering involved transforming existing data and creating new features that could provide more useful information to a model. I worked with techniques such as extracting relevant information from existing variables, encoding categorical data, converting textual information into numerical representations, and creating derived features from related attributes. I also learned about </w:t>
+        <w:t xml:space="preserve">, which are important processes for improving the quality and effectiveness of machine learning models. Feature engineering involved transforming existing data and creating new features that could provide more useful information to a model. I worked with techniques such as extracting relevant information from existing variables, encoding categorical data, converting textual information into numerical representations and creating derived features from related attributes. I also learned about </w:t>
       </w:r>
       <w:r>
         <w:rPr>
@@ -8217,7 +8217,7 @@
           <w:sz w:val="24"/>
           <w:szCs w:val="24"/>
         </w:rPr>
-        <w:t xml:space="preserve">, as well as the distinction between training, validation, and testing data. Practical exercises involved algorithms such as </w:t>
+        <w:t xml:space="preserve">, as well as the distinction between training, validation and testing data. Practical exercises involved algorithms such as </w:t>
       </w:r>
       <w:r>
         <w:rPr>
@@ -8244,7 +8244,7 @@
           <w:szCs w:val="24"/>
         </w:rPr>
         <w:lastRenderedPageBreak/>
-        <w:t>model training. The training also introduced concepts such as model fitting, hyperparameters, overfitting, and generalization. Through practical implementation, I developed a better understanding of how machine learning algorithms can be applied to solve real-world prediction and classification problems.</w:t>
+        <w:t>model training. The training also introduced concepts such as model fitting, hyperparameters, overfitting and generalization. Through practical implementation, I developed a better understanding of how machine learning algorithms can be applied to solve real-world prediction and classification problems.</w:t>
       </w:r>
     </w:p>
     <w:p>
@@ -8307,7 +8307,7 @@
           <w:sz w:val="24"/>
           <w:szCs w:val="24"/>
         </w:rPr>
-        <w:t xml:space="preserve">, which involved teaching models to identify patterns in prepared datasets and assessing their ability to make reliable predictions on previously unseen data. During the training, I learned how to divide datasets into training, validation, and testing subsets and how to fit machine learning algorithms using the training data. Different evaluation metrics were studied according to the type of machine learning problem, including </w:t>
+        <w:t xml:space="preserve">, which involved teaching models to identify patterns in prepared datasets and assessing their ability to make reliable predictions on previously unseen data. During the training, I learned how to divide datasets into training, validation and testing subsets and how to fit machine learning algorithms using the training data. Different evaluation metrics were studied according to the type of machine learning problem, including </w:t>
       </w:r>
       <w:r>
         <w:rPr>
@@ -8317,7 +8317,7 @@
           <w:sz w:val="24"/>
           <w:szCs w:val="24"/>
         </w:rPr>
-        <w:t>accuracy, precision, recall, F1-score, confusion matrix, and mean squared error</w:t>
+        <w:t>accuracy, precision, recall, F1-score, confusion matrix and mean squared error</w:t>
       </w:r>
       <w:r>
         <w:rPr>
@@ -8343,7 +8343,7 @@
           <w:sz w:val="24"/>
           <w:szCs w:val="24"/>
         </w:rPr>
-        <w:t>. Model evaluation provided a means of determining whether a trained model generalizes beyond the data used during training. Through practical exercises, I gained experience in interpreting evaluation results and using them to determine whether a model required further preprocessing, feature engineering, or adjustment before being considered suitable for a particular application.</w:t>
+        <w:t>. Model evaluation provided a means of determining whether a trained model generalizes beyond the data used during training. Through practical exercises, I gained experience in interpreting evaluation results and using them to determine whether a model required further preprocessing, feature engineering or adjustment before being considered suitable for a particular application.</w:t>
       </w:r>
     </w:p>
     <w:p>
@@ -8422,7 +8422,7 @@
           <w:sz w:val="24"/>
           <w:szCs w:val="24"/>
         </w:rPr>
-        <w:t xml:space="preserve">, and derive useful information from human language. The training covered fundamental techniques for preparing textual data for machine learning, including text cleaning, tokenization, removal of unnecessary characters and words, and conversion of text into numerical representations. I also gained an understanding of techniques such as </w:t>
+        <w:t xml:space="preserve"> and derive useful information from human language. The training covered fundamental techniques for preparing textual data for machine learning, including text cleaning, tokenization, removal of unnecessary characters and words and conversion of text into numerical representations. I also gained an understanding of techniques such as </w:t>
       </w:r>
       <w:r>
         <w:rPr>
@@ -8530,7 +8530,7 @@
           <w:sz w:val="24"/>
           <w:szCs w:val="24"/>
         </w:rPr>
-        <w:t xml:space="preserve">. These projects provided opportunities to work through different stages of the machine learning workflow, from understanding and preparing datasets to selecting features, training models, evaluating results, and interpreting predictions. Through these practical exercises, I worked with different types of datasets and explored machine learning techniques applicable to problems such as prediction, classification, recommendation, and text analysis. The projects also strengthened my ability to identify problems, determine appropriate approaches, troubleshoot errors, and iteratively improve solutions based on observed results. In addition to improving my technical proficiency in Python and machine learning libraries, project development enhanced my problem-solving, analytical, debugging, and research skills. The practical experience gained through these projects also provided the foundation for the development of my final SIWES project, an </w:t>
+        <w:t xml:space="preserve">. These projects provided opportunities to work through different stages of the machine learning workflow, from understanding and preparing datasets to selecting features, training models, evaluating results, and interpreting predictions. Through these practical exercises, I worked with different types of datasets and explored machine learning techniques applicable to problems such as prediction, classification, recommendation and text analysis. The projects also strengthened my ability to identify problems, determine appropriate approaches, troubleshoot errors, and iteratively improve solutions based on observed results. In addition to improving my technical proficiency in Python and machine learning libraries, project development enhanced my problem-solving, analytical, debugging, and research skills. The practical experience gained through these projects also provided the foundation for the development of my final SIWES project, an </w:t>
       </w:r>
       <w:r>
         <w:rPr>
@@ -8890,7 +8890,7 @@
           <w:szCs w:val="24"/>
         </w:rPr>
         <w:lastRenderedPageBreak/>
-        <w:t>Similarity to determine the degree of textual similarity between the candidate's profile and the job requirements. In addition to textual similarity, the system evaluates explicit skill overlap and relevant experience to provide a broader assessment of candidate suitability. These factors are combined to produce an interpretable candidate match score and a corresponding recommendation such as Interview, Manual Review, or Not Qualified. The system also presents supporting information, including matched skills, missing or unclear skills, experience relevance, and an overall assessment, allowing users to understand the basis of the generated result. The application was implemented with a simple user interface using Streamlit, providing an accessible environment through which users can submit candidate and job information and receive the resulting analysis. The system is intended to support human decision-making rather than make autonomous employment decisions, ensuring that final recruitment decisions remain subject to human review.</w:t>
+        <w:t>Similarity to determine the degree of textual similarity between the candidate's profile and the job requirements. In addition to textual similarity, the system evaluates explicit skill overlap and relevant experience to provide a broader assessment of candidate suitability. These factors are combined to produce an interpretable candidate match score and a corresponding recommendation such as Interview, Manual Review or Not Qualified. The system also presents supporting information, including matched skills, missing or unclear skills, experience relevance, and an overall assessment, allowing users to understand the basis of the generated result. The application was implemented with a simple user interface using Streamlit, providing an accessible environment through which users can submit candidate and job information and receive the resulting analysis. The system is intended to support human decision-making rather than make autonomous employment decisions, ensuring that final recruitment decisions remain subject to human review.</w:t>
       </w:r>
     </w:p>
     <w:p>
@@ -9737,7 +9737,7 @@
           <w:szCs w:val="24"/>
         </w:rPr>
         <w:lastRenderedPageBreak/>
-        <w:t>The project focuses on NLP-based CV-job matching, skill comparison, experience matching, candidate scoring and screening recommendations. It does not attempt to implement a complete recruitment platform, an applicant tracking system, or replace human recruiters.</w:t>
+        <w:t>The project focuses on NLP-based CV-job matching, skill comparison, experience matching, candidate scoring and screening recommendations. It does not attempt to implement a complete recruitment platform, an applicant tracking system or replace human recruiters.</w:t>
       </w:r>
     </w:p>
     <w:p>
@@ -9893,7 +9893,7 @@
           <w:sz w:val="24"/>
           <w:szCs w:val="24"/>
         </w:rPr>
-        <w:t>The expected outcome is a functional prototype capable of processing a candidate CV and job description, measuring their textual and attribute-level compatibility, and presenting the resulting evidence through a simple user interface. The project demonstrates the application of Natural Language Processing and machine-learning concepts to a practical recruitment-support problem.</w:t>
+        <w:t>The expected outcome is a functional prototype capable of processing a candidate CV and job description, measuring their textual and attribute-level compatibility and presenting the resulting evidence through a simple user interface. The project demonstrates the application of Natural Language Processing and machine-learning concepts to a practical recruitment-support problem.</w:t>
       </w:r>
     </w:p>
     <w:p>
@@ -12455,7 +12455,7 @@
           <w:sz w:val="24"/>
           <w:szCs w:val="24"/>
         </w:rPr>
-        <w:t>The dataset came with a predefined data_split column dividing it into training, validation, and test partitions:</w:t>
+        <w:t>The dataset came with a predefined data_split column dividing it into training, validation and test partitions:</w:t>
       </w:r>
     </w:p>
     <w:tbl>
@@ -19134,14 +19134,6 @@
           <w:szCs w:val="24"/>
         </w:rPr>
       </w:pPr>
-      <w:r>
-        <w:rPr>
-          <w:rFonts w:eastAsia="Calibri"/>
-          <w:sz w:val="24"/>
-          <w:szCs w:val="24"/>
-        </w:rPr>
-        <w:t>(See Appendix A / the accompanying notebook for the complete function implementation.)</w:t>
-      </w:r>
     </w:p>
     <w:p>
       <w:pPr>
@@ -20908,7 +20900,15 @@
           <w:sz w:val="24"/>
           <w:szCs w:val="24"/>
         </w:rPr>
-        <w:t>This system is intended for recruiters and HR teams as a first-pass screening aid, helping them prioritize which applications to review first rather than making autonomous hiring decisions. Its main value is consistency and speed at the initial screening stage — flagging the strongest matches for interview, filtering out clear non-matches, and routing genuinely ambiguous cases to a human reviewer, exactly as demonstrated in the Manual Review example in Section 9.1.</w:t>
+        <w:t>This system is intended for recruiters and HR teams as a first-pass screening aid, helping them prioritize which applications to review first rather than making autonomous hiring decisions. Its main value is consistency and speed at the initial screening stage — flagging the strongest matches for interview, filtering out clear non-matches and routing genuinely ambiguous cases to a human reviewer, exactly as demonstrated in the Manual Review example</w:t>
+      </w:r>
+      <w:r>
+        <w:rPr>
+          <w:rFonts w:eastAsia="Calibri"/>
+          <w:sz w:val="24"/>
+          <w:szCs w:val="24"/>
+        </w:rPr>
+        <w:t>.</w:t>
       </w:r>
     </w:p>
     <w:p>
@@ -32049,6 +32049,7 @@
   <w:style w:type="character" w:default="1" w:styleId="DefaultParagraphFont">
     <w:name w:val="Default Paragraph Font"/>
     <w:uiPriority w:val="1"/>
+    <w:semiHidden/>
     <w:unhideWhenUsed/>
   </w:style>
   <w:style w:type="table" w:default="1" w:styleId="TableNormal">

</xml_diff>